<commit_message>
Added Docker and getting ready for deployment.
</commit_message>
<xml_diff>
--- a/backend/templates_registry/templates/air/template.docx
+++ b/backend/templates_registry/templates/air/template.docx
@@ -264,6 +264,46 @@
           <w:highlight w:val="none"/>
         </w:rPr>
         <w:t xml:space="preserve">Roll Number: {{CMS_ID}}</w:t>
+      </w:r>
+      <w:r>
+        <w:rPr>
+          <w:color w:val="000000" w:themeColor="text1"/>
+          <w:sz w:val="36"/>
+          <w:szCs w:val="36"/>
+          <w:highlight w:val="none"/>
+        </w:rPr>
+      </w:r>
+      <w:r>
+        <w:rPr>
+          <w:color w:val="000000" w:themeColor="text1"/>
+          <w:sz w:val="36"/>
+          <w:szCs w:val="36"/>
+          <w:highlight w:val="none"/>
+        </w:rPr>
+      </w:r>
+    </w:p>
+    <w:p>
+      <w:pPr>
+        <w:pStyle w:val="1022"/>
+        <w:pBdr/>
+        <w:spacing/>
+        <w:ind/>
+        <w:jc w:val="center"/>
+        <w:rPr>
+          <w:color w:val="000000" w:themeColor="text1"/>
+          <w:sz w:val="36"/>
+          <w:szCs w:val="36"/>
+          <w:highlight w:val="none"/>
+        </w:rPr>
+      </w:pPr>
+      <w:r>
+        <w:rPr>
+          <w:color w:val="000000" w:themeColor="text1"/>
+          <w:sz w:val="36"/>
+          <w:szCs w:val="36"/>
+          <w:highlight w:val="none"/>
+        </w:rPr>
+        <w:t xml:space="preserve">Class/Section: {{CLASS_SECTION}}</w:t>
       </w:r>
       <w:r>
         <w:rPr>

</xml_diff>

<commit_message>
Added different programming language compatibility besides python and c++
</commit_message>
<xml_diff>
--- a/backend/templates_registry/templates/air/template.docx
+++ b/backend/templates_registry/templates/air/template.docx
@@ -304,6 +304,46 @@
           <w:highlight w:val="none"/>
         </w:rPr>
         <w:t xml:space="preserve">Class/Section: {{CLASS_SECTION}}</w:t>
+      </w:r>
+      <w:r>
+        <w:rPr>
+          <w:color w:val="000000" w:themeColor="text1"/>
+          <w:sz w:val="36"/>
+          <w:szCs w:val="36"/>
+          <w:highlight w:val="none"/>
+        </w:rPr>
+      </w:r>
+      <w:r>
+        <w:rPr>
+          <w:color w:val="000000" w:themeColor="text1"/>
+          <w:sz w:val="36"/>
+          <w:szCs w:val="36"/>
+          <w:highlight w:val="none"/>
+        </w:rPr>
+      </w:r>
+    </w:p>
+    <w:p>
+      <w:pPr>
+        <w:pStyle w:val="1022"/>
+        <w:pBdr/>
+        <w:spacing/>
+        <w:ind/>
+        <w:jc w:val="center"/>
+        <w:rPr>
+          <w:color w:val="000000" w:themeColor="text1"/>
+          <w:sz w:val="36"/>
+          <w:szCs w:val="36"/>
+          <w:highlight w:val="none"/>
+        </w:rPr>
+      </w:pPr>
+      <w:r>
+        <w:rPr>
+          <w:color w:val="000000" w:themeColor="text1"/>
+          <w:sz w:val="36"/>
+          <w:szCs w:val="36"/>
+          <w:highlight w:val="none"/>
+        </w:rPr>
+        <w:t xml:space="preserve">Date: {{DATE}}</w:t>
       </w:r>
       <w:r>
         <w:rPr>

</xml_diff>